<commit_message>
Apply LIGHTYEAR primary brand system across product surfaces
</commit_message>
<xml_diff>
--- a/docs/milestones/MS-01/MS-01.docx
+++ b/docs/milestones/MS-01/MS-01.docx
@@ -8,9 +8,9 @@
       </w:pPr>
       <w:r>
         <w:rPr>
-          <w:rFonts w:ascii="Calibri" w:hAnsi="Calibri"/>
+          <w:rFonts w:ascii="Arial" w:hAnsi="Arial"/>
           <w:b/>
-          <w:color w:val="9A6B16"/>
+          <w:color w:val="A7702C"/>
           <w:sz w:val="18"/>
         </w:rPr>
         <w:t>CUSTOMER MILESTONE BRIEF</w:t>
@@ -22,9 +22,9 @@
       </w:pPr>
       <w:r>
         <w:rPr>
-          <w:rFonts w:ascii="Calibri" w:hAnsi="Calibri"/>
+          <w:rFonts w:ascii="Arial" w:hAnsi="Arial"/>
           <w:b/>
-          <w:color w:val="0B2545"/>
+          <w:color w:val="15184D"/>
           <w:sz w:val="56"/>
         </w:rPr>
         <w:t>MS #01 - Source-Faithful Local Oracle</w:t>
@@ -36,8 +36,8 @@
       </w:pPr>
       <w:r>
         <w:rPr>
-          <w:rFonts w:ascii="Calibri" w:hAnsi="Calibri"/>
-          <w:color w:val="4B5563"/>
+          <w:rFonts w:ascii="Arial" w:hAnsi="Arial"/>
+          <w:color w:val="676985"/>
           <w:sz w:val="27"/>
         </w:rPr>
         <w:t>Purpose, customer value, delivered capability, evidence, and claim boundaries</w:t>
@@ -66,14 +66,14 @@
               <w:end w:w="120" w:type="dxa"/>
             </w:tcMar>
             <w:vAlign w:val="center"/>
-            <w:shd w:fill="F2F4F7"/>
+            <w:shd w:fill="EFEBFB"/>
           </w:tcPr>
           <w:p>
             <w:r>
               <w:rPr>
-                <w:rFonts w:ascii="Calibri" w:hAnsi="Calibri"/>
+                <w:rFonts w:ascii="Arial" w:hAnsi="Arial"/>
                 <w:b/>
-                <w:color w:val="1F4D78"/>
+                <w:color w:val="15184D"/>
               </w:rPr>
               <w:t>Status</w:t>
             </w:r>
@@ -93,7 +93,7 @@
           <w:p>
             <w:r>
               <w:rPr>
-                <w:rFonts w:ascii="Calibri" w:hAnsi="Calibri"/>
+                <w:rFonts w:ascii="Arial" w:hAnsi="Arial"/>
               </w:rPr>
               <w:t>Complete</w:t>
             </w:r>
@@ -111,14 +111,14 @@
               <w:end w:w="120" w:type="dxa"/>
             </w:tcMar>
             <w:vAlign w:val="center"/>
-            <w:shd w:fill="F2F4F7"/>
+            <w:shd w:fill="EFEBFB"/>
           </w:tcPr>
           <w:p>
             <w:r>
               <w:rPr>
-                <w:rFonts w:ascii="Calibri" w:hAnsi="Calibri"/>
+                <w:rFonts w:ascii="Arial" w:hAnsi="Arial"/>
                 <w:b/>
-                <w:color w:val="1F4D78"/>
+                <w:color w:val="15184D"/>
               </w:rPr>
               <w:t>Release</w:t>
             </w:r>
@@ -138,7 +138,7 @@
           <w:p>
             <w:r>
               <w:rPr>
-                <w:rFonts w:ascii="Calibri" w:hAnsi="Calibri"/>
+                <w:rFonts w:ascii="Arial" w:hAnsi="Arial"/>
               </w:rPr>
               <w:t>0.1.0 (historical initial commit)</w:t>
             </w:r>
@@ -156,14 +156,14 @@
               <w:end w:w="120" w:type="dxa"/>
             </w:tcMar>
             <w:vAlign w:val="center"/>
-            <w:shd w:fill="F2F4F7"/>
+            <w:shd w:fill="EFEBFB"/>
           </w:tcPr>
           <w:p>
             <w:r>
               <w:rPr>
-                <w:rFonts w:ascii="Calibri" w:hAnsi="Calibri"/>
+                <w:rFonts w:ascii="Arial" w:hAnsi="Arial"/>
                 <w:b/>
-                <w:color w:val="1F4D78"/>
+                <w:color w:val="15184D"/>
               </w:rPr>
               <w:t>Date</w:t>
             </w:r>
@@ -183,7 +183,7 @@
           <w:p>
             <w:r>
               <w:rPr>
-                <w:rFonts w:ascii="Calibri" w:hAnsi="Calibri"/>
+                <w:rFonts w:ascii="Arial" w:hAnsi="Arial"/>
               </w:rPr>
               <w:t>2026-08-10</w:t>
             </w:r>
@@ -201,14 +201,14 @@
               <w:end w:w="120" w:type="dxa"/>
             </w:tcMar>
             <w:vAlign w:val="center"/>
-            <w:shd w:fill="F2F4F7"/>
+            <w:shd w:fill="EFEBFB"/>
           </w:tcPr>
           <w:p>
             <w:r>
               <w:rPr>
-                <w:rFonts w:ascii="Calibri" w:hAnsi="Calibri"/>
+                <w:rFonts w:ascii="Arial" w:hAnsi="Arial"/>
                 <w:b/>
-                <w:color w:val="1F4D78"/>
+                <w:color w:val="15184D"/>
               </w:rPr>
               <w:t>Audience</w:t>
             </w:r>
@@ -228,7 +228,7 @@
           <w:p>
             <w:r>
               <w:rPr>
-                <w:rFonts w:ascii="Calibri" w:hAnsi="Calibri"/>
+                <w:rFonts w:ascii="Arial" w:hAnsi="Arial"/>
               </w:rPr>
               <w:t>Customers, partners, executives, architects, delivery teams, and assurance reviewers</w:t>
             </w:r>
@@ -441,25 +441,11 @@
         <w:t>docs/milestones/catalog.json metadata and docs/milestones/manifest.json artifact integrity</w:t>
       </w:r>
     </w:p>
-    <w:p>
-      <w:pPr>
-        <w:spacing w:before="200"/>
-      </w:pPr>
-      <w:r>
-        <w:rPr>
-          <w:rFonts w:ascii="Calibri" w:hAnsi="Calibri"/>
-          <w:i/>
-          <w:color w:val="6B7280"/>
-          <w:sz w:val="18"/>
-        </w:rPr>
-        <w:t>The underlying schemas, receipts, ledgers, tests, and policy decisions remain authoritative when greater detail is required.</w:t>
-      </w:r>
-    </w:p>
     <w:sectPr>
       <w:headerReference w:type="default" r:id="rId9"/>
       <w:footerReference w:type="default" r:id="rId10"/>
       <w:pgSz w:w="12240" w:h="15840"/>
-      <w:pgMar w:top="1440" w:right="1440" w:bottom="1440" w:left="1440" w:header="708" w:footer="708" w:gutter="0"/>
+      <w:pgMar w:top="1267" w:right="1440" w:bottom="1440" w:left="1440" w:header="403" w:footer="708" w:gutter="0"/>
       <w:cols w:space="720"/>
       <w:docGrid w:linePitch="360"/>
     </w:sectPr>
@@ -472,14 +458,26 @@
   <w:p>
     <w:pPr>
       <w:pStyle w:val="Footer"/>
-      <w:jc w:val="right"/>
+      <w:tabs>
+        <w:tab w:pos="9360" w:val="right"/>
+      </w:tabs>
+      <w:jc w:val="left"/>
     </w:pPr>
     <w:r>
       <w:rPr>
-        <w:rFonts w:ascii="Calibri" w:hAnsi="Calibri"/>
-        <w:color w:val="6B7280"/>
+        <w:rFonts w:ascii="Arial" w:hAnsi="Arial"/>
+        <w:color w:val="676985"/>
+        <w:sz w:val="15"/>
+      </w:rPr>
+      <w:t>Underlying evidence remains authoritative.</w:t>
+    </w:r>
+    <w:r>
+      <w:rPr>
+        <w:rFonts w:ascii="Arial" w:hAnsi="Arial"/>
+        <w:color w:val="676985"/>
         <w:sz w:val="17"/>
       </w:rPr>
+      <w:tab/>
       <w:t xml:space="preserve">MS #01  |  Page </w:t>
     </w:r>
     <w:r>
@@ -498,18 +496,53 @@
   <w:p>
     <w:pPr>
       <w:pStyle w:val="Header"/>
+      <w:spacing w:after="40"/>
       <w:pBdr>
-        <w:bottom w:val="single" w:sz="6" w:space="3" w:color="D7DBE2"/>
+        <w:bottom w:val="single" w:sz="7" w:space="3" w:color="A7702C"/>
       </w:pBdr>
     </w:pPr>
     <w:r>
-      <w:rPr>
-        <w:rFonts w:ascii="Calibri" w:hAnsi="Calibri"/>
-        <w:b/>
-        <w:color w:val="6B7280"/>
-        <w:sz w:val="17"/>
-      </w:rPr>
-      <w:t>LIGHTYEAR  |  MILESTONE DOCUMENTATION</w:t>
+      <w:drawing>
+        <wp:inline xmlns:a="http://schemas.openxmlformats.org/drawingml/2006/main" xmlns:pic="http://schemas.openxmlformats.org/drawingml/2006/picture">
+          <wp:extent cx="960120" cy="586740"/>
+          <wp:docPr id="1" name="Picture 1"/>
+          <wp:cNvGraphicFramePr>
+            <a:graphicFrameLocks noChangeAspect="1"/>
+          </wp:cNvGraphicFramePr>
+          <a:graphic>
+            <a:graphicData uri="http://schemas.openxmlformats.org/drawingml/2006/picture">
+              <pic:pic>
+                <pic:nvPicPr>
+                  <pic:cNvPr id="0" name="lightyear-primary.png"/>
+                  <pic:cNvPicPr/>
+                </pic:nvPicPr>
+                <pic:blipFill>
+                  <a:blip r:embed="rId1"/>
+                  <a:stretch>
+                    <a:fillRect/>
+                  </a:stretch>
+                </pic:blipFill>
+                <pic:spPr>
+                  <a:xfrm>
+                    <a:off x="0" y="0"/>
+                    <a:ext cx="960120" cy="586740"/>
+                  </a:xfrm>
+                  <a:prstGeom prst="rect"/>
+                </pic:spPr>
+              </pic:pic>
+            </a:graphicData>
+          </a:graphic>
+        </wp:inline>
+      </w:drawing>
+    </w:r>
+    <w:r>
+      <w:rPr>
+        <w:rFonts w:ascii="Arial" w:hAnsi="Arial"/>
+        <w:b/>
+        <w:color w:val="676985"/>
+        <w:sz w:val="16"/>
+      </w:rPr>
+      <w:t xml:space="preserve">   MILESTONE DOCUMENTATION</w:t>
     </w:r>
   </w:p>
 </w:hdr>
@@ -879,11 +912,12 @@
     <w:qFormat/>
     <w:rsid w:val="00FC693F"/>
     <w:pPr>
-      <w:spacing w:after="120" w:line="264" w:lineRule="auto"/>
+      <w:spacing w:after="100" w:line="259" w:lineRule="auto"/>
     </w:pPr>
     <w:rPr>
-      <w:rFonts w:ascii="Calibri" w:hAnsi="Calibri"/>
-      <w:sz w:val="22"/>
+      <w:rFonts w:ascii="Arial" w:hAnsi="Arial"/>
+      <w:color w:val="15184D"/>
+      <w:sz w:val="20"/>
     </w:rPr>
   </w:style>
   <w:style w:type="paragraph" w:styleId="Header">
@@ -941,15 +975,15 @@
     <w:pPr>
       <w:keepNext/>
       <w:keepLines/>
-      <w:spacing w:before="320" w:after="160"/>
+      <w:spacing w:before="260" w:after="120"/>
       <w:outlineLvl w:val="0"/>
     </w:pPr>
     <w:rPr>
-      <w:rFonts w:asciiTheme="majorHAnsi" w:eastAsiaTheme="majorEastAsia" w:hAnsiTheme="majorHAnsi" w:cstheme="majorBidi" w:ascii="Calibri" w:hAnsi="Calibri"/>
+      <w:rFonts w:asciiTheme="majorHAnsi" w:eastAsiaTheme="majorEastAsia" w:hAnsiTheme="majorHAnsi" w:cstheme="majorBidi" w:ascii="Arial" w:hAnsi="Arial"/>
       <w:b/>
       <w:bCs/>
-      <w:color w:val="2E74B5"/>
-      <w:sz w:val="32"/>
+      <w:color w:val="7D57EA"/>
+      <w:sz w:val="31"/>
       <w:szCs w:val="28"/>
     </w:rPr>
   </w:style>
@@ -965,14 +999,14 @@
     <w:pPr>
       <w:keepNext/>
       <w:keepLines/>
-      <w:spacing w:before="240" w:after="120"/>
+      <w:spacing w:before="220" w:after="100"/>
       <w:outlineLvl w:val="1"/>
     </w:pPr>
     <w:rPr>
-      <w:rFonts w:asciiTheme="majorHAnsi" w:eastAsiaTheme="majorEastAsia" w:hAnsiTheme="majorHAnsi" w:cstheme="majorBidi" w:ascii="Calibri" w:hAnsi="Calibri"/>
+      <w:rFonts w:asciiTheme="majorHAnsi" w:eastAsiaTheme="majorEastAsia" w:hAnsiTheme="majorHAnsi" w:cstheme="majorBidi" w:ascii="Arial" w:hAnsi="Arial"/>
       <w:b/>
       <w:bCs/>
-      <w:color w:val="2E74B5"/>
+      <w:color w:val="7D57EA"/>
       <w:sz w:val="26"/>
       <w:szCs w:val="26"/>
     </w:rPr>
@@ -993,10 +1027,10 @@
       <w:outlineLvl w:val="2"/>
     </w:pPr>
     <w:rPr>
-      <w:rFonts w:asciiTheme="majorHAnsi" w:eastAsiaTheme="majorEastAsia" w:hAnsiTheme="majorHAnsi" w:cstheme="majorBidi" w:ascii="Calibri" w:hAnsi="Calibri"/>
+      <w:rFonts w:asciiTheme="majorHAnsi" w:eastAsiaTheme="majorEastAsia" w:hAnsiTheme="majorHAnsi" w:cstheme="majorBidi" w:ascii="Arial" w:hAnsi="Arial"/>
       <w:b/>
       <w:bCs/>
-      <w:color w:val="1F4D78"/>
+      <w:color w:val="15184D"/>
       <w:sz w:val="24"/>
     </w:rPr>
   </w:style>
@@ -1413,13 +1447,13 @@
       <w:numPr>
         <w:numId w:val="1"/>
       </w:numPr>
-      <w:spacing w:after="160" w:line="280" w:lineRule="auto"/>
+      <w:spacing w:after="100" w:line="264" w:lineRule="auto"/>
       <w:ind w:left="720" w:hanging="360"/>
       <w:contextualSpacing/>
     </w:pPr>
     <w:rPr>
-      <w:rFonts w:ascii="Calibri" w:hAnsi="Calibri"/>
-      <w:sz w:val="22"/>
+      <w:rFonts w:ascii="Arial" w:hAnsi="Arial"/>
+      <w:sz w:val="20"/>
     </w:rPr>
   </w:style>
   <w:style w:type="paragraph" w:styleId="ListBullet2">
@@ -1458,13 +1492,13 @@
       <w:numPr>
         <w:numId w:val="5"/>
       </w:numPr>
-      <w:spacing w:after="160" w:line="280" w:lineRule="auto"/>
+      <w:spacing w:after="100" w:line="264" w:lineRule="auto"/>
       <w:ind w:left="720" w:hanging="360"/>
       <w:contextualSpacing/>
     </w:pPr>
     <w:rPr>
-      <w:rFonts w:ascii="Calibri" w:hAnsi="Calibri"/>
-      <w:sz w:val="22"/>
+      <w:rFonts w:ascii="Arial" w:hAnsi="Arial"/>
+      <w:sz w:val="20"/>
     </w:rPr>
   </w:style>
   <w:style w:type="paragraph" w:styleId="ListNumber2">

</xml_diff>

<commit_message>
Apply LIGHTYEAR brand system across web, docs, and decks
</commit_message>
<xml_diff>
--- a/docs/milestones/MS-01/MS-01.docx
+++ b/docs/milestones/MS-01/MS-01.docx
@@ -504,7 +504,7 @@
     <w:r>
       <w:drawing>
         <wp:inline xmlns:a="http://schemas.openxmlformats.org/drawingml/2006/main" xmlns:pic="http://schemas.openxmlformats.org/drawingml/2006/picture">
-          <wp:extent cx="960120" cy="586740"/>
+          <wp:extent cx="960120" cy="586313"/>
           <wp:docPr id="1" name="Picture 1"/>
           <wp:cNvGraphicFramePr>
             <a:graphicFrameLocks noChangeAspect="1"/>
@@ -525,7 +525,7 @@
                 <pic:spPr>
                   <a:xfrm>
                     <a:off x="0" y="0"/>
-                    <a:ext cx="960120" cy="586740"/>
+                    <a:ext cx="960120" cy="586313"/>
                   </a:xfrm>
                   <a:prstGeom prst="rect"/>
                 </pic:spPr>

</xml_diff>

<commit_message>
feat: inventory iDempiere Oracle reference estate
</commit_message>
<xml_diff>
--- a/docs/milestones/MS-01/MS-01.docx
+++ b/docs/milestones/MS-01/MS-01.docx
@@ -455,39 +455,79 @@
 
 <file path=word/footer1.xml><?xml version="1.0" encoding="utf-8"?>
 <w:ftr xmlns:m="http://schemas.openxmlformats.org/officeDocument/2006/math" xmlns:mc="http://schemas.openxmlformats.org/markup-compatibility/2006" xmlns:mo="http://schemas.microsoft.com/office/mac/office/2008/main" xmlns:mv="urn:schemas-microsoft-com:mac:vml" xmlns:o="urn:schemas-microsoft-com:office:office" xmlns:r="http://schemas.openxmlformats.org/officeDocument/2006/relationships" xmlns:v="urn:schemas-microsoft-com:vml" xmlns:w10="urn:schemas-microsoft-com:office:word" xmlns:w14="http://schemas.microsoft.com/office/word/2010/wordml" xmlns:w="http://schemas.openxmlformats.org/wordprocessingml/2006/main" xmlns:wne="http://schemas.microsoft.com/office/word/2006/wordml" xmlns:wp14="http://schemas.microsoft.com/office/word/2010/wordprocessingDrawing" xmlns:wp="http://schemas.openxmlformats.org/drawingml/2006/wordprocessingDrawing" xmlns:wpc="http://schemas.microsoft.com/office/word/2010/wordprocessingCanvas" xmlns:wpg="http://schemas.microsoft.com/office/word/2010/wordprocessingGroup" xmlns:wpi="http://schemas.microsoft.com/office/word/2010/wordprocessingInk" xmlns:wps="http://schemas.microsoft.com/office/word/2010/wordprocessingShape" mc:Ignorable="w14 wp14">
-  <w:p>
-    <w:pPr>
-      <w:pStyle w:val="Footer"/>
-      <w:tabs>
-        <w:tab w:pos="9360" w:val="right"/>
-      </w:tabs>
-      <w:jc w:val="left"/>
-    </w:pPr>
-    <w:r>
-      <w:rPr>
-        <w:rFonts w:ascii="Arial" w:hAnsi="Arial"/>
-        <w:color w:val="676985"/>
-        <w:sz w:val="15"/>
-      </w:rPr>
-      <w:t>Underlying evidence remains authoritative.</w:t>
-    </w:r>
-    <w:r>
-      <w:rPr>
-        <w:rFonts w:ascii="Arial" w:hAnsi="Arial"/>
-        <w:color w:val="676985"/>
-        <w:sz w:val="17"/>
-      </w:rPr>
-      <w:tab/>
-      <w:t xml:space="preserve">MS #01  |  Page </w:t>
-    </w:r>
-    <w:r>
-      <w:fldChar w:fldCharType="begin"/>
-      <w:instrText> PAGE </w:instrText>
-      <w:fldChar w:fldCharType="separate"/>
-      <w:t>1</w:t>
-      <w:fldChar w:fldCharType="end"/>
-    </w:r>
-  </w:p>
+  <w:tbl>
+    <w:tblPr>
+      <w:tblLook w:firstColumn="1" w:firstRow="1" w:lastColumn="0" w:lastRow="0" w:noHBand="0" w:noVBand="1" w:val="04A0"/>
+      <w:tblW w:w="9360" w:type="dxa"/>
+      <w:tblInd w:w="0" w:type="dxa"/>
+      <w:tblLayout w:type="fixed"/>
+    </w:tblPr>
+    <w:tblGrid>
+      <w:gridCol w:w="6000"/>
+      <w:gridCol w:w="3360"/>
+    </w:tblGrid>
+    <w:tr>
+      <w:tc>
+        <w:tcPr>
+          <w:tcW w:type="dxa" w:w="6000"/>
+          <w:tcMar>
+            <w:top w:w="80" w:type="dxa"/>
+            <w:bottom w:w="80" w:type="dxa"/>
+            <w:start w:w="120" w:type="dxa"/>
+            <w:end w:w="120" w:type="dxa"/>
+          </w:tcMar>
+          <w:vAlign w:val="center"/>
+        </w:tcPr>
+        <w:p>
+          <w:pPr>
+            <w:spacing w:after="0"/>
+            <w:jc w:val="left"/>
+          </w:pPr>
+          <w:r>
+            <w:rPr>
+              <w:rFonts w:ascii="Arial" w:hAnsi="Arial"/>
+              <w:color w:val="676985"/>
+              <w:sz w:val="15"/>
+            </w:rPr>
+            <w:t>Underlying evidence remains authoritative.</w:t>
+          </w:r>
+        </w:p>
+      </w:tc>
+      <w:tc>
+        <w:tcPr>
+          <w:tcW w:type="dxa" w:w="3360"/>
+          <w:tcMar>
+            <w:top w:w="80" w:type="dxa"/>
+            <w:bottom w:w="80" w:type="dxa"/>
+            <w:start w:w="120" w:type="dxa"/>
+            <w:end w:w="120" w:type="dxa"/>
+          </w:tcMar>
+          <w:vAlign w:val="center"/>
+        </w:tcPr>
+        <w:p>
+          <w:pPr>
+            <w:spacing w:after="0"/>
+            <w:jc w:val="right"/>
+          </w:pPr>
+          <w:r>
+            <w:rPr>
+              <w:rFonts w:ascii="Arial" w:hAnsi="Arial"/>
+              <w:color w:val="676985"/>
+              <w:sz w:val="17"/>
+            </w:rPr>
+            <w:t xml:space="preserve">MS #01  |  Page </w:t>
+          </w:r>
+          <w:r>
+            <w:fldChar w:fldCharType="begin"/>
+            <w:instrText> PAGE </w:instrText>
+            <w:fldChar w:fldCharType="separate"/>
+            <w:t>1</w:t>
+            <w:fldChar w:fldCharType="end"/>
+          </w:r>
+        </w:p>
+      </w:tc>
+    </w:tr>
+  </w:tbl>
 </w:ftr>
 </file>
 

</xml_diff>